<commit_message>
Added Multimedia Appendix Files
Added Multimedia Appendix Files
</commit_message>
<xml_diff>
--- a/NDI_Multimedia_Appendix_1.docx
+++ b/NDI_Multimedia_Appendix_1.docx
@@ -13,27 +13,7 @@
           <w:sz w:val="28"/>
           <w:szCs w:val="28"/>
         </w:rPr>
-        <w:t xml:space="preserve">Multimedia Appendix 1. Consolidated deviation </w:t>
-      </w:r>
-      <w:proofErr w:type="gramStart"/>
-      <w:r>
-        <w:rPr>
-          <w:b/>
-          <w:bCs/>
-          <w:sz w:val="28"/>
-          <w:szCs w:val="28"/>
-        </w:rPr>
-        <w:t>note:</w:t>
-      </w:r>
-      <w:proofErr w:type="gramEnd"/>
-      <w:r>
-        <w:rPr>
-          <w:b/>
-          <w:bCs/>
-          <w:sz w:val="28"/>
-          <w:szCs w:val="28"/>
-        </w:rPr>
-        <w:t xml:space="preserve"> original implementation to final (release v1.5-final)</w:t>
+        <w:t>Multimedia Appendix 1. Implementation audit: initial pipeline to final pipeline (release v1.5-final)</w:t>
       </w:r>
     </w:p>
     <w:p>
@@ -41,7 +21,7 @@
         <w:spacing w:after="120" w:line="264" w:lineRule="auto"/>
       </w:pPr>
       <w:r>
-        <w:t xml:space="preserve">This appendix records every change between the original implementation (repository tag v1) and the final analysis (release v1.5-final): the five corrections described in the manuscript, their effect on the primary numbers, the analyses added after the original results were known, and the data-integrity checks. No analysis was run for this appendix. Every value is taken from the results archive in the public repository [1] and is given to three decimals; the file holding each value is named in the tables. ρ is the within-participant Spearman correlation between predictions and target; </w:t>
+        <w:t xml:space="preserve">This appendix records every change between the initial pipeline (repository tag v1) and the final pipeline (release v1.5-final): the five fixes described in the manuscript, their effect on the primary numbers, the analyses added in the second stage, after the first-stage results were known, and the data-integrity checks. No analysis was run for this appendix. Every value is taken from the results archive in the public repository [1] and is given to three decimals; the file holding each value is named in the tables. ρ is the within-participant Spearman correlation between predictions and target; </w:t>
       </w:r>
       <w:proofErr w:type="spellStart"/>
       <w:r>
@@ -59,7 +39,7 @@
       <w:proofErr w:type="spellEnd"/>
       <w:proofErr w:type="gramEnd"/>
       <w:r>
-        <w:t>.</w:t>
+        <w:t>. Rows and days in Table A1 are counted from 0, so test row 16 is day 17 in the manuscript's Figure 1.</w:t>
       </w:r>
     </w:p>
     <w:p>
@@ -67,7 +47,7 @@
         <w:pStyle w:val="Heading1"/>
       </w:pPr>
       <w:r>
-        <w:t>Corrections to the original implementation</w:t>
+        <w:t>Fixes from the implementation audit</w:t>
       </w:r>
     </w:p>
     <w:p>
@@ -89,7 +69,7 @@
           <w:sz w:val="20"/>
           <w:szCs w:val="20"/>
         </w:rPr>
-        <w:t xml:space="preserve"> The five corrections, in the order used in the manuscript (Methods, Corrections to the original implementation).</w:t>
+        <w:t xml:space="preserve"> The five fixes, in the order used in the manuscript (Methods, Implementation audit).</w:t>
       </w:r>
     </w:p>
     <w:tbl>
@@ -107,7 +87,7 @@
           <w:left w:w="10" w:type="dxa"/>
           <w:right w:w="10" w:type="dxa"/>
         </w:tblCellMar>
-        <w:tblLook w:val="0000" w:firstRow="0" w:lastRow="0" w:firstColumn="0" w:lastColumn="0" w:noHBand="0" w:noVBand="0"/>
+        <w:tblLook w:val="04A0" w:firstRow="1" w:lastRow="0" w:firstColumn="1" w:lastColumn="0" w:noHBand="0" w:noVBand="1"/>
       </w:tblPr>
       <w:tblGrid>
         <w:gridCol w:w="1206"/>
@@ -118,6 +98,12 @@
         <w:gridCol w:w="4037"/>
       </w:tblGrid>
       <w:tr>
+        <w:tblPrEx>
+          <w:tblCellMar>
+            <w:top w:w="0" w:type="dxa"/>
+            <w:bottom w:w="0" w:type="dxa"/>
+          </w:tblCellMar>
+        </w:tblPrEx>
         <w:trPr>
           <w:cantSplit/>
           <w:tblHeader/>
@@ -149,7 +135,7 @@
                 <w:sz w:val="18"/>
                 <w:szCs w:val="18"/>
               </w:rPr>
-              <w:t>Correction</w:t>
+              <w:t>Fix</w:t>
             </w:r>
           </w:p>
         </w:tc>
@@ -310,6 +296,12 @@
         </w:tc>
       </w:tr>
       <w:tr>
+        <w:tblPrEx>
+          <w:tblCellMar>
+            <w:top w:w="0" w:type="dxa"/>
+            <w:bottom w:w="0" w:type="dxa"/>
+          </w:tblCellMar>
+        </w:tblPrEx>
         <w:trPr>
           <w:cantSplit/>
         </w:trPr>
@@ -428,7 +420,23 @@
                 <w:sz w:val="18"/>
                 <w:szCs w:val="18"/>
               </w:rPr>
-              <w:t>Review of the target code, whose comment described it as next-day. Writing out the day arithmetic of the first test fold (participant p01, test row 16) showed that its target averaged days 9–15.</w:t>
+              <w:t xml:space="preserve">Review of the target code, whose comment described it as </w:t>
+            </w:r>
+            <w:proofErr w:type="gramStart"/>
+            <w:r>
+              <w:rPr>
+                <w:sz w:val="18"/>
+                <w:szCs w:val="18"/>
+              </w:rPr>
+              <w:t>next-day</w:t>
+            </w:r>
+            <w:proofErr w:type="gramEnd"/>
+            <w:r>
+              <w:rPr>
+                <w:sz w:val="18"/>
+                <w:szCs w:val="18"/>
+              </w:rPr>
+              <w:t>. Writing out the day arithmetic of the first test fold (participant p01, test row 16) showed that its target averaged days 9–15.</w:t>
             </w:r>
           </w:p>
         </w:tc>
@@ -543,7 +551,23 @@
                 <w:sz w:val="18"/>
                 <w:szCs w:val="18"/>
               </w:rPr>
-              <w:t>config_v1_3_forward.json (TARGET_ALIGNMENT, FORWARD_TARGET_MIN_PERIODS)</w:t>
+              <w:t>config_v1_3_</w:t>
+            </w:r>
+            <w:proofErr w:type="gramStart"/>
+            <w:r>
+              <w:rPr>
+                <w:sz w:val="18"/>
+                <w:szCs w:val="18"/>
+              </w:rPr>
+              <w:t>forward.json</w:t>
+            </w:r>
+            <w:proofErr w:type="gramEnd"/>
+            <w:r>
+              <w:rPr>
+                <w:sz w:val="18"/>
+                <w:szCs w:val="18"/>
+              </w:rPr>
+              <w:t xml:space="preserve"> (TARGET_ALIGNMENT, FORWARD_TARGET_MIN_PERIODS)</w:t>
             </w:r>
           </w:p>
           <w:p>
@@ -573,6 +597,12 @@
         </w:tc>
       </w:tr>
       <w:tr>
+        <w:tblPrEx>
+          <w:tblCellMar>
+            <w:top w:w="0" w:type="dxa"/>
+            <w:bottom w:w="0" w:type="dxa"/>
+          </w:tblCellMar>
+        </w:tblPrEx>
         <w:trPr>
           <w:cantSplit/>
         </w:trPr>
@@ -660,7 +690,7 @@
                 <w:sz w:val="18"/>
                 <w:szCs w:val="18"/>
               </w:rPr>
-              <w:t>A mask-dependence check of T during the first run of the revision analyses (version 1.1, uncorrected path; superseded and not archived): T values changed when part of the series was withheld, so T depended on days outside the training fold. The imputation medians and the target normalisation were then found by code inspection.</w:t>
+              <w:t>A mask-dependence check of T during the first run of the second-stage analyses (version 1.1, before this fix; superseded and not archived): T values changed when part of the series was withheld, so T depended on days outside the training fold. The imputation medians and the target normalisation were then found by code inspection.</w:t>
             </w:r>
           </w:p>
         </w:tc>
@@ -775,7 +805,23 @@
                 <w:sz w:val="18"/>
                 <w:szCs w:val="18"/>
               </w:rPr>
-              <w:t>config_v1_2_correction.json (FEATURE_NORMALISATION, IMPUTATION_FEATURES, IMPUTATION_TARGETS, TARGET_STATS)</w:t>
+              <w:t>config_v1_2_</w:t>
+            </w:r>
+            <w:proofErr w:type="gramStart"/>
+            <w:r>
+              <w:rPr>
+                <w:sz w:val="18"/>
+                <w:szCs w:val="18"/>
+              </w:rPr>
+              <w:t>correction.json</w:t>
+            </w:r>
+            <w:proofErr w:type="gramEnd"/>
+            <w:r>
+              <w:rPr>
+                <w:sz w:val="18"/>
+                <w:szCs w:val="18"/>
+              </w:rPr>
+              <w:t xml:space="preserve"> (FEATURE_NORMALISATION, IMPUTATION_FEATURES, IMPUTATION_TARGETS, TARGET_STATS)</w:t>
             </w:r>
           </w:p>
           <w:p>
@@ -805,6 +851,12 @@
         </w:tc>
       </w:tr>
       <w:tr>
+        <w:tblPrEx>
+          <w:tblCellMar>
+            <w:top w:w="0" w:type="dxa"/>
+            <w:bottom w:w="0" w:type="dxa"/>
+          </w:tblCellMar>
+        </w:tblPrEx>
         <w:trPr>
           <w:cantSplit/>
         </w:trPr>
@@ -862,7 +914,7 @@
                 <w:sz w:val="18"/>
                 <w:szCs w:val="18"/>
               </w:rPr>
-              <w:t>The 6-day embargo left a one-day overlap between training and test. Under the original trailing target, the last training day (day 9 for p01) lay inside the first test target window (days 9–15). Under a forward target, the last training row's own target window (days 10–16) contains the test day.</w:t>
+              <w:t>The 6-day embargo left a one-day overlap between training and test. Under the initial trailing target, the last training day (day 9 for p01) lay inside the first test target window (days 9–15). Under a forward target, the last training row's own target window (days 10–16) contains the test day.</w:t>
             </w:r>
           </w:p>
         </w:tc>
@@ -920,7 +972,23 @@
                 <w:sz w:val="18"/>
                 <w:szCs w:val="18"/>
               </w:rPr>
-              <w:t>Training rows whose target window overlaps the test day or its target window are dropped from the fold. For the 7-day targets this removes one training row per fold, giving an effective gap of 7 days; for next-day targets it removes none.</w:t>
+              <w:t xml:space="preserve">Training rows whose target window overlaps the test </w:t>
+            </w:r>
+            <w:proofErr w:type="gramStart"/>
+            <w:r>
+              <w:rPr>
+                <w:sz w:val="18"/>
+                <w:szCs w:val="18"/>
+              </w:rPr>
+              <w:t>day</w:t>
+            </w:r>
+            <w:proofErr w:type="gramEnd"/>
+            <w:r>
+              <w:rPr>
+                <w:sz w:val="18"/>
+                <w:szCs w:val="18"/>
+              </w:rPr>
+              <w:t xml:space="preserve"> or its target window are dropped from the fold. For the 7-day targets this removes one training row per fold, giving an effective gap of 7 days; for next-day targets it removes none.</w:t>
             </w:r>
           </w:p>
         </w:tc>
@@ -1006,7 +1074,23 @@
                 <w:sz w:val="18"/>
                 <w:szCs w:val="18"/>
               </w:rPr>
-              <w:t>config_v1_2_correction.json (PURGE_SUPPORT_OVERLAP)</w:t>
+              <w:t>config_v1_2_</w:t>
+            </w:r>
+            <w:proofErr w:type="gramStart"/>
+            <w:r>
+              <w:rPr>
+                <w:sz w:val="18"/>
+                <w:szCs w:val="18"/>
+              </w:rPr>
+              <w:t>correction.json</w:t>
+            </w:r>
+            <w:proofErr w:type="gramEnd"/>
+            <w:r>
+              <w:rPr>
+                <w:sz w:val="18"/>
+                <w:szCs w:val="18"/>
+              </w:rPr>
+              <w:t xml:space="preserve"> (PURGE_SUPPORT_OVERLAP)</w:t>
             </w:r>
           </w:p>
           <w:p>
@@ -1064,6 +1148,12 @@
         </w:tc>
       </w:tr>
       <w:tr>
+        <w:tblPrEx>
+          <w:tblCellMar>
+            <w:top w:w="0" w:type="dxa"/>
+            <w:bottom w:w="0" w:type="dxa"/>
+          </w:tblCellMar>
+        </w:tblPrEx>
         <w:trPr>
           <w:cantSplit/>
         </w:trPr>
@@ -1250,7 +1340,23 @@
                 <w:sz w:val="18"/>
                 <w:szCs w:val="18"/>
               </w:rPr>
-              <w:t>config_v1_4.json (DATA_ROWS, WELLNESS_USE)</w:t>
+              <w:t>config_v1_</w:t>
+            </w:r>
+            <w:proofErr w:type="gramStart"/>
+            <w:r>
+              <w:rPr>
+                <w:sz w:val="18"/>
+                <w:szCs w:val="18"/>
+              </w:rPr>
+              <w:t>4.json</w:t>
+            </w:r>
+            <w:proofErr w:type="gramEnd"/>
+            <w:r>
+              <w:rPr>
+                <w:sz w:val="18"/>
+                <w:szCs w:val="18"/>
+              </w:rPr>
+              <w:t xml:space="preserve"> (DATA_ROWS, WELLNESS_USE)</w:t>
             </w:r>
           </w:p>
           <w:p>
@@ -1263,9 +1369,18 @@
                 <w:sz w:val="18"/>
                 <w:szCs w:val="18"/>
               </w:rPr>
-              <w:t>NDI_duplicate_days_check.ipynb</w:t>
+              <w:t>NDI_duplicate_days_</w:t>
+            </w:r>
+            <w:proofErr w:type="gramStart"/>
+            <w:r>
+              <w:rPr>
+                <w:sz w:val="18"/>
+                <w:szCs w:val="18"/>
+              </w:rPr>
+              <w:t>check.ipynb</w:t>
             </w:r>
             <w:proofErr w:type="spellEnd"/>
+            <w:proofErr w:type="gramEnd"/>
           </w:p>
           <w:p>
             <w:pPr>
@@ -1303,6 +1418,12 @@
         </w:tc>
       </w:tr>
       <w:tr>
+        <w:tblPrEx>
+          <w:tblCellMar>
+            <w:top w:w="0" w:type="dxa"/>
+            <w:bottom w:w="0" w:type="dxa"/>
+          </w:tblCellMar>
+        </w:tblPrEx>
         <w:trPr>
           <w:cantSplit/>
         </w:trPr>
@@ -1513,20 +1634,45 @@
                 <w:sz w:val="18"/>
                 <w:szCs w:val="18"/>
               </w:rPr>
-              <w:t>config_v1_4.json (P12_DECISION)</w:t>
-            </w:r>
-          </w:p>
-          <w:p>
-            <w:pPr>
-              <w:spacing w:after="40"/>
-            </w:pPr>
-            <w:r>
-              <w:rPr>
-                <w:sz w:val="18"/>
-                <w:szCs w:val="18"/>
-              </w:rPr>
-              <w:t>NDI_v1_4_prechecks.ipynb</w:t>
-            </w:r>
+              <w:t>config_v1_</w:t>
+            </w:r>
+            <w:proofErr w:type="gramStart"/>
+            <w:r>
+              <w:rPr>
+                <w:sz w:val="18"/>
+                <w:szCs w:val="18"/>
+              </w:rPr>
+              <w:t>4.json</w:t>
+            </w:r>
+            <w:proofErr w:type="gramEnd"/>
+            <w:r>
+              <w:rPr>
+                <w:sz w:val="18"/>
+                <w:szCs w:val="18"/>
+              </w:rPr>
+              <w:t xml:space="preserve"> (P12_DECISION)</w:t>
+            </w:r>
+          </w:p>
+          <w:p>
+            <w:pPr>
+              <w:spacing w:after="40"/>
+            </w:pPr>
+            <w:r>
+              <w:rPr>
+                <w:sz w:val="18"/>
+                <w:szCs w:val="18"/>
+              </w:rPr>
+              <w:t>NDI_v1_4_</w:t>
+            </w:r>
+            <w:proofErr w:type="gramStart"/>
+            <w:r>
+              <w:rPr>
+                <w:sz w:val="18"/>
+                <w:szCs w:val="18"/>
+              </w:rPr>
+              <w:t>prechecks.ipynb</w:t>
+            </w:r>
+            <w:proofErr w:type="gramEnd"/>
           </w:p>
           <w:p>
             <w:pPr>
@@ -1604,11 +1750,11 @@
       </w:r>
       <w:proofErr w:type="spellEnd"/>
       <w:r>
-        <w:t xml:space="preserve">) on the self-derived and raw-feature targets from the original implementation to the final one. The archive holds a run at every version and, inside the v1.4 run, the primary analysis without p12, so corrections 4 and 5 can be separated. </w:t>
+        <w:t xml:space="preserve">) on the self-derived and raw-feature targets from the initial pipeline to the final one. The archive holds a run at every version and, inside the v1.4 run, the primary analysis without p12, so fixes 4 and 5 can be separated. Fixes 2 and 3 were </w:t>
       </w:r>
       <w:r>
         <w:lastRenderedPageBreak/>
-        <w:t>Corrections 2 and 3 were introduced together in version 1.2 and cannot be separated without a new run, which was not made. The release v1.5-final contains no new run of the primary analysis; its values are those of version 1.4.</w:t>
+        <w:t>introduced together in version 1.2 and cannot be separated without a new run, which was not made. The release v1.5-final contains no new run of the primary analysis; its values are those of version 1.4.</w:t>
       </w:r>
     </w:p>
     <w:p>
@@ -1664,7 +1810,7 @@
           <w:left w:w="10" w:type="dxa"/>
           <w:right w:w="10" w:type="dxa"/>
         </w:tblCellMar>
-        <w:tblLook w:val="0000" w:firstRow="0" w:lastRow="0" w:firstColumn="0" w:lastColumn="0" w:noHBand="0" w:noVBand="0"/>
+        <w:tblLook w:val="04A0" w:firstRow="1" w:lastRow="0" w:firstColumn="1" w:lastColumn="0" w:noHBand="0" w:noVBand="1"/>
       </w:tblPr>
       <w:tblGrid>
         <w:gridCol w:w="1450"/>
@@ -1677,6 +1823,12 @@
         <w:gridCol w:w="1805"/>
       </w:tblGrid>
       <w:tr>
+        <w:tblPrEx>
+          <w:tblCellMar>
+            <w:top w:w="0" w:type="dxa"/>
+            <w:bottom w:w="0" w:type="dxa"/>
+          </w:tblCellMar>
+        </w:tblPrEx>
         <w:trPr>
           <w:cantSplit/>
           <w:tblHeader/>
@@ -1770,7 +1922,7 @@
                 <w:sz w:val="18"/>
                 <w:szCs w:val="18"/>
               </w:rPr>
-              <w:t>Corrections added at this step</w:t>
+              <w:t>Fixes added at this step</w:t>
             </w:r>
           </w:p>
         </w:tc>
@@ -1947,12 +2099,38 @@
                 <w:sz w:val="18"/>
                 <w:szCs w:val="18"/>
               </w:rPr>
-              <w:t>Change from previous step, raw-feature (95% CI)</w:t>
+              <w:t xml:space="preserve">Change from previous step, </w:t>
+            </w:r>
+            <w:proofErr w:type="gramStart"/>
+            <w:r>
+              <w:rPr>
+                <w:b/>
+                <w:bCs/>
+                <w:sz w:val="18"/>
+                <w:szCs w:val="18"/>
+              </w:rPr>
+              <w:t>raw-feature</w:t>
+            </w:r>
+            <w:proofErr w:type="gramEnd"/>
+            <w:r>
+              <w:rPr>
+                <w:b/>
+                <w:bCs/>
+                <w:sz w:val="18"/>
+                <w:szCs w:val="18"/>
+              </w:rPr>
+              <w:t xml:space="preserve"> (95% CI)</w:t>
             </w:r>
           </w:p>
         </w:tc>
       </w:tr>
       <w:tr>
+        <w:tblPrEx>
+          <w:tblCellMar>
+            <w:top w:w="0" w:type="dxa"/>
+            <w:bottom w:w="0" w:type="dxa"/>
+          </w:tblCellMar>
+        </w:tblPrEx>
         <w:trPr>
           <w:cantSplit/>
         </w:trPr>
@@ -1981,7 +2159,7 @@
                 <w:sz w:val="18"/>
                 <w:szCs w:val="18"/>
               </w:rPr>
-              <w:t>Original (v1)</w:t>
+              <w:t>Initial (v1)</w:t>
             </w:r>
           </w:p>
         </w:tc>
@@ -2039,7 +2217,7 @@
                 <w:sz w:val="18"/>
                 <w:szCs w:val="18"/>
               </w:rPr>
-              <w:t>None (original implementation; trailing target)</w:t>
+              <w:t>None (initial pipeline; trailing target)</w:t>
             </w:r>
           </w:p>
         </w:tc>
@@ -2190,6 +2368,12 @@
         </w:tc>
       </w:tr>
       <w:tr>
+        <w:tblPrEx>
+          <w:tblCellMar>
+            <w:top w:w="0" w:type="dxa"/>
+            <w:bottom w:w="0" w:type="dxa"/>
+          </w:tblCellMar>
+        </w:tblPrEx>
         <w:trPr>
           <w:cantSplit/>
         </w:trPr>
@@ -2427,6 +2611,12 @@
         </w:tc>
       </w:tr>
       <w:tr>
+        <w:tblPrEx>
+          <w:tblCellMar>
+            <w:top w:w="0" w:type="dxa"/>
+            <w:bottom w:w="0" w:type="dxa"/>
+          </w:tblCellMar>
+        </w:tblPrEx>
         <w:trPr>
           <w:cantSplit/>
         </w:trPr>
@@ -2664,6 +2854,12 @@
         </w:tc>
       </w:tr>
       <w:tr>
+        <w:tblPrEx>
+          <w:tblCellMar>
+            <w:top w:w="0" w:type="dxa"/>
+            <w:bottom w:w="0" w:type="dxa"/>
+          </w:tblCellMar>
+        </w:tblPrEx>
         <w:trPr>
           <w:cantSplit/>
         </w:trPr>
@@ -2901,6 +3097,12 @@
         </w:tc>
       </w:tr>
       <w:tr>
+        <w:tblPrEx>
+          <w:tblCellMar>
+            <w:top w:w="0" w:type="dxa"/>
+            <w:bottom w:w="0" w:type="dxa"/>
+          </w:tblCellMar>
+        </w:tblPrEx>
         <w:trPr>
           <w:cantSplit/>
         </w:trPr>
@@ -3156,6 +3358,12 @@
         </w:tc>
       </w:tr>
       <w:tr>
+        <w:tblPrEx>
+          <w:tblCellMar>
+            <w:top w:w="0" w:type="dxa"/>
+            <w:bottom w:w="0" w:type="dxa"/>
+          </w:tblCellMar>
+        </w:tblPrEx>
         <w:trPr>
           <w:cantSplit/>
         </w:trPr>
@@ -3418,7 +3626,7 @@
           <w:sz w:val="18"/>
           <w:szCs w:val="18"/>
         </w:rPr>
-        <w:t xml:space="preserve"> was also recomputed from the per-participant files of its version (table1_corrected_self_target_per_participant.csv, raw_target_corrected_per_participant.csv, and the supplementary_without_p12 files in results_v1.4), and every value agreed to three decimals. The v1 values are the archived values of the original implementation; the v1.2 run regenerated them exactly (results_v1.2/handin_check.txt). Intervals are bias-corrected and accelerated bootstrap 95% CIs (10,000 resamples, seed 42) over participants. Changes from the previous step are paired over the same 15 participants. The changes sum to the overall change: 0.193 − 0.096 + 0.093 − 0.004 + 0.026 = 0.213 (self-derived) and −0.076 − 0.010 + 0.124 − 0.025 + 0.012 = 0.025 (raw-feature), allowing for rounding.</w:t>
+        <w:t xml:space="preserve"> was also recomputed from the per-participant files of its version (table1_corrected_self_target_per_participant.csv, raw_target_corrected_per_participant.csv, and the supplementary_without_p12 files in results_v1.4), and every value agreed to three decimals. The v1 values are the archived values of the initial pipeline; the v1.2 run regenerated them exactly (results_v1.2/handin_check.txt). Intervals are bias-corrected and accelerated bootstrap 95% CIs (10,000 resamples, seed 42) over participants. Changes from the previous step are paired over the same 15 participants. The changes sum to the overall change: 0.193 − 0.096 + 0.093 − 0.004 + 0.026 = 0.213 (self-derived) and −0.076 − 0.010 + 0.124 − 0.025 + 0.012 = 0.025 (raw-feature), allowing for rounding.</w:t>
       </w:r>
     </w:p>
     <w:p>
@@ -3475,7 +3683,7 @@
         <w:pStyle w:val="Heading1"/>
       </w:pPr>
       <w:r>
-        <w:t>Deviations from the original plan</w:t>
+        <w:t>Deviations from the first-stage plan</w:t>
       </w:r>
     </w:p>
     <w:p>
@@ -3483,11 +3691,19 @@
         <w:spacing w:after="120" w:line="264" w:lineRule="auto"/>
       </w:pPr>
       <w:r>
-        <w:t xml:space="preserve">The original analysis (primary endpoint, arms, evaluation protocol and raw-feature control) was fixed before its results were inspected. The analyses in Table A3 were specified during revision, after the original results were known. Each was fixed in a configuration file before its own run. From version 1.3 onward each configuration was committed and tagged before the run, with two exceptions: version 1.2 was not tagged, and the learnability diagnostic ran from the version 1.4-task3 code without a tag of its own. Labels follow the manuscript: post hoc for quantities </w:t>
+        <w:t xml:space="preserve">The first-stage analysis (primary endpoint, arms, evaluation protocol and raw-feature control) was fixed before its results were inspected. The analyses in Table A3 were specified in the second stage, after the first-stage results were known. Each was fixed in a configuration file before its own run. From version 1.3 onward each configuration was committed and tagged before the run, with two exceptions: version 1.2 was not tagged, and the learnability diagnostic ran from the version 1.4-task3 code without a tag of its own. Labels follow the manuscript: post hoc for </w:t>
       </w:r>
       <w:r>
         <w:lastRenderedPageBreak/>
-        <w:t>defined after their own results were seen, and exploratory for quantities defined before their results but outside the primary family. Analyses the manuscript gives neither label are marked revision analysis.</w:t>
+        <w:t xml:space="preserve">quantities defined after their own results were seen, and exploratory for quantities defined before their results but outside the primary family. Analyses the manuscript gives neither label </w:t>
+      </w:r>
+      <w:proofErr w:type="gramStart"/>
+      <w:r>
+        <w:t>are</w:t>
+      </w:r>
+      <w:proofErr w:type="gramEnd"/>
+      <w:r>
+        <w:t xml:space="preserve"> marked second-stage analysis.</w:t>
       </w:r>
     </w:p>
     <w:p>
@@ -3509,7 +3725,7 @@
           <w:sz w:val="20"/>
           <w:szCs w:val="20"/>
         </w:rPr>
-        <w:t xml:space="preserve"> Analyses added after the original results were known.</w:t>
+        <w:t xml:space="preserve"> Analyses added in the second stage, after the first-stage results were known.</w:t>
       </w:r>
     </w:p>
     <w:tbl>
@@ -3527,7 +3743,7 @@
           <w:left w:w="10" w:type="dxa"/>
           <w:right w:w="10" w:type="dxa"/>
         </w:tblCellMar>
-        <w:tblLook w:val="0000" w:firstRow="0" w:lastRow="0" w:firstColumn="0" w:lastColumn="0" w:noHBand="0" w:noVBand="0"/>
+        <w:tblLook w:val="04A0" w:firstRow="1" w:lastRow="0" w:firstColumn="1" w:lastColumn="0" w:noHBand="0" w:noVBand="1"/>
       </w:tblPr>
       <w:tblGrid>
         <w:gridCol w:w="2100"/>
@@ -3536,6 +3752,12 @@
         <w:gridCol w:w="2400"/>
       </w:tblGrid>
       <w:tr>
+        <w:tblPrEx>
+          <w:tblCellMar>
+            <w:top w:w="0" w:type="dxa"/>
+            <w:bottom w:w="0" w:type="dxa"/>
+          </w:tblCellMar>
+        </w:tblPrEx>
         <w:trPr>
           <w:cantSplit/>
           <w:tblHeader/>
@@ -3666,6 +3888,12 @@
         </w:tc>
       </w:tr>
       <w:tr>
+        <w:tblPrEx>
+          <w:tblCellMar>
+            <w:top w:w="0" w:type="dxa"/>
+            <w:bottom w:w="0" w:type="dxa"/>
+          </w:tblCellMar>
+        </w:tblPrEx>
         <w:trPr>
           <w:cantSplit/>
         </w:trPr>
@@ -3768,7 +3996,23 @@
                 <w:sz w:val="18"/>
                 <w:szCs w:val="18"/>
               </w:rPr>
-              <w:t xml:space="preserve">First fixed in config_v1_2_correction.json (SESOI 0.10; bootstrap </w:t>
+              <w:t>First fixed in config_v1_2_</w:t>
+            </w:r>
+            <w:proofErr w:type="gramStart"/>
+            <w:r>
+              <w:rPr>
+                <w:sz w:val="18"/>
+                <w:szCs w:val="18"/>
+              </w:rPr>
+              <w:t>correction.json</w:t>
+            </w:r>
+            <w:proofErr w:type="gramEnd"/>
+            <w:r>
+              <w:rPr>
+                <w:sz w:val="18"/>
+                <w:szCs w:val="18"/>
+              </w:rPr>
+              <w:t xml:space="preserve"> (SESOI 0.10; bootstrap </w:t>
             </w:r>
             <w:proofErr w:type="spellStart"/>
             <w:r>
@@ -3813,12 +4057,18 @@
                 <w:sz w:val="18"/>
                 <w:szCs w:val="18"/>
               </w:rPr>
-              <w:t>Revision analysis</w:t>
+              <w:t>Second-stage analysis</w:t>
             </w:r>
           </w:p>
         </w:tc>
       </w:tr>
       <w:tr>
+        <w:tblPrEx>
+          <w:tblCellMar>
+            <w:top w:w="0" w:type="dxa"/>
+            <w:bottom w:w="0" w:type="dxa"/>
+          </w:tblCellMar>
+        </w:tblPrEx>
         <w:trPr>
           <w:cantSplit/>
         </w:trPr>
@@ -3876,7 +4126,7 @@
                 <w:sz w:val="18"/>
                 <w:szCs w:val="18"/>
               </w:rPr>
-              <w:t>Five leaks (L0–L4) implemented as switches on the corrected pipeline; inflation of V3's mean ρ with each leak added alone, and the cumulative effect of removing them in a fixed order.</w:t>
+              <w:t>Five leaks (L0–L4) implemented as switches on the final pipeline; inflation of V3's mean ρ with each leak added alone, and the cumulative effect of removing them in a fixed order.</w:t>
             </w:r>
           </w:p>
         </w:tc>
@@ -3905,7 +4155,39 @@
                 <w:sz w:val="18"/>
                 <w:szCs w:val="18"/>
               </w:rPr>
-              <w:t>Leak definitions and removal order (L2, L4, L3, L1, L0) first fixed in config_v1_2_correction.json, version 1.2, not tagged; unchanged in v1.3-forward and v1.4. The reading of L2 under the forward target as the persistence forecast was fixed in config_task3_v1_4.json, v1.4-task3 (1a3c297).</w:t>
+              <w:t>Leak definitions and removal order (L2, L4, L3, L1, L0) first fixed in config_v1_2_</w:t>
+            </w:r>
+            <w:proofErr w:type="gramStart"/>
+            <w:r>
+              <w:rPr>
+                <w:sz w:val="18"/>
+                <w:szCs w:val="18"/>
+              </w:rPr>
+              <w:t>correction.json</w:t>
+            </w:r>
+            <w:proofErr w:type="gramEnd"/>
+            <w:r>
+              <w:rPr>
+                <w:sz w:val="18"/>
+                <w:szCs w:val="18"/>
+              </w:rPr>
+              <w:t>, version 1.2, not tagged; unchanged in v1.3-forward and v1.4. The reading of L2 under the forward target as the persistence forecast was fixed in config_task3_v1_</w:t>
+            </w:r>
+            <w:proofErr w:type="gramStart"/>
+            <w:r>
+              <w:rPr>
+                <w:sz w:val="18"/>
+                <w:szCs w:val="18"/>
+              </w:rPr>
+              <w:t>4.json</w:t>
+            </w:r>
+            <w:proofErr w:type="gramEnd"/>
+            <w:r>
+              <w:rPr>
+                <w:sz w:val="18"/>
+                <w:szCs w:val="18"/>
+              </w:rPr>
+              <w:t>, v1.4-task3 (1a3c297).</w:t>
             </w:r>
           </w:p>
         </w:tc>
@@ -3934,12 +4216,18 @@
                 <w:sz w:val="18"/>
                 <w:szCs w:val="18"/>
               </w:rPr>
-              <w:t>Revision analysis</w:t>
+              <w:t>Second-stage analysis</w:t>
             </w:r>
           </w:p>
         </w:tc>
       </w:tr>
       <w:tr>
+        <w:tblPrEx>
+          <w:tblCellMar>
+            <w:top w:w="0" w:type="dxa"/>
+            <w:bottom w:w="0" w:type="dxa"/>
+          </w:tblCellMar>
+        </w:tblPrEx>
         <w:trPr>
           <w:cantSplit/>
         </w:trPr>
@@ -4026,7 +4314,39 @@
                 <w:sz w:val="18"/>
                 <w:szCs w:val="18"/>
               </w:rPr>
-              <w:t>Wellness rules W1–W4 fixed in config_v1_4.json, v1.4 (4dabbfe), before any self-report result. Targets, eligibility and statistics fixed in config_task3_v1_4.json, v1.4-task3 (1a3c297).</w:t>
+              <w:t>Wellness rules W1–W4 fixed in config_v1_</w:t>
+            </w:r>
+            <w:proofErr w:type="gramStart"/>
+            <w:r>
+              <w:rPr>
+                <w:sz w:val="18"/>
+                <w:szCs w:val="18"/>
+              </w:rPr>
+              <w:t>4.json</w:t>
+            </w:r>
+            <w:proofErr w:type="gramEnd"/>
+            <w:r>
+              <w:rPr>
+                <w:sz w:val="18"/>
+                <w:szCs w:val="18"/>
+              </w:rPr>
+              <w:t>, v1.4 (4dabbfe), before any self-report result. Targets, eligibility and statistics fixed in config_task3_v1_</w:t>
+            </w:r>
+            <w:proofErr w:type="gramStart"/>
+            <w:r>
+              <w:rPr>
+                <w:sz w:val="18"/>
+                <w:szCs w:val="18"/>
+              </w:rPr>
+              <w:t>4.json</w:t>
+            </w:r>
+            <w:proofErr w:type="gramEnd"/>
+            <w:r>
+              <w:rPr>
+                <w:sz w:val="18"/>
+                <w:szCs w:val="18"/>
+              </w:rPr>
+              <w:t>, v1.4-task3 (1a3c297).</w:t>
             </w:r>
           </w:p>
         </w:tc>
@@ -4055,12 +4375,18 @@
                 <w:sz w:val="18"/>
                 <w:szCs w:val="18"/>
               </w:rPr>
-              <w:t>Revision analysis</w:t>
+              <w:t>Second-stage analysis</w:t>
             </w:r>
           </w:p>
         </w:tc>
       </w:tr>
       <w:tr>
+        <w:tblPrEx>
+          <w:tblCellMar>
+            <w:top w:w="0" w:type="dxa"/>
+            <w:bottom w:w="0" w:type="dxa"/>
+          </w:tblCellMar>
+        </w:tblPrEx>
         <w:trPr>
           <w:cantSplit/>
         </w:trPr>
@@ -4118,7 +4444,7 @@
                 <w:sz w:val="18"/>
                 <w:szCs w:val="18"/>
               </w:rPr>
-              <w:t>No-model persistence forecast (today's value) for every target, as reference rows outside the correction family; V3 minus persistence on the self-derived target.</w:t>
+              <w:t>No-model persistence forecast (today's value) for every target, as reference rows outside the multiplicity family; V3 minus persistence on the self-derived target.</w:t>
             </w:r>
           </w:p>
         </w:tc>
@@ -4147,7 +4473,23 @@
                 <w:sz w:val="18"/>
                 <w:szCs w:val="18"/>
               </w:rPr>
-              <w:t>config_task3_v1_4.json (PERSISTENCE_REFERENCES), v1.4-task3 (1a3c297).</w:t>
+              <w:t>config_task3_v1_</w:t>
+            </w:r>
+            <w:proofErr w:type="gramStart"/>
+            <w:r>
+              <w:rPr>
+                <w:sz w:val="18"/>
+                <w:szCs w:val="18"/>
+              </w:rPr>
+              <w:t>4.json</w:t>
+            </w:r>
+            <w:proofErr w:type="gramEnd"/>
+            <w:r>
+              <w:rPr>
+                <w:sz w:val="18"/>
+                <w:szCs w:val="18"/>
+              </w:rPr>
+              <w:t xml:space="preserve"> (PERSISTENCE_REFERENCES), v1.4-task3 (1a3c297).</w:t>
             </w:r>
           </w:p>
         </w:tc>
@@ -4182,6 +4524,12 @@
         </w:tc>
       </w:tr>
       <w:tr>
+        <w:tblPrEx>
+          <w:tblCellMar>
+            <w:top w:w="0" w:type="dxa"/>
+            <w:bottom w:w="0" w:type="dxa"/>
+          </w:tblCellMar>
+        </w:tblPrEx>
         <w:trPr>
           <w:cantSplit/>
         </w:trPr>
@@ -4268,7 +4616,23 @@
                 <w:sz w:val="18"/>
                 <w:szCs w:val="18"/>
               </w:rPr>
-              <w:t>stage0_config.json, written by the notebook before the run and not tagged separately. The run used the v1.4-task3 code (commit 1a3c297, recorded in results_task4_stage0/</w:t>
+              <w:t>stage0_</w:t>
+            </w:r>
+            <w:proofErr w:type="gramStart"/>
+            <w:r>
+              <w:rPr>
+                <w:sz w:val="18"/>
+                <w:szCs w:val="18"/>
+              </w:rPr>
+              <w:t>config.json</w:t>
+            </w:r>
+            <w:proofErr w:type="gramEnd"/>
+            <w:r>
+              <w:rPr>
+                <w:sz w:val="18"/>
+                <w:szCs w:val="18"/>
+              </w:rPr>
+              <w:t>, written by the notebook before the run and not tagged separately. The run used the v1.4-task3 code (commit 1a3c297, recorded in results_task4_stage0/</w:t>
             </w:r>
             <w:proofErr w:type="spellStart"/>
             <w:r>
@@ -4319,6 +4683,12 @@
         </w:tc>
       </w:tr>
       <w:tr>
+        <w:tblPrEx>
+          <w:tblCellMar>
+            <w:top w:w="0" w:type="dxa"/>
+            <w:bottom w:w="0" w:type="dxa"/>
+          </w:tblCellMar>
+        </w:tblPrEx>
         <w:trPr>
           <w:cantSplit/>
         </w:trPr>
@@ -4421,7 +4791,23 @@
                 <w:sz w:val="18"/>
                 <w:szCs w:val="18"/>
               </w:rPr>
-              <w:t>Defined before the v1.3 run in config_v1_3_forward.json (EXPLORATORY), v1.3-forward (54b5c73); unchanged in v1.4 (4dabbfe). Reported values are from v1.4.</w:t>
+              <w:t>Defined before the v1.3 run in config_v1_3_</w:t>
+            </w:r>
+            <w:proofErr w:type="gramStart"/>
+            <w:r>
+              <w:rPr>
+                <w:sz w:val="18"/>
+                <w:szCs w:val="18"/>
+              </w:rPr>
+              <w:t>forward.json</w:t>
+            </w:r>
+            <w:proofErr w:type="gramEnd"/>
+            <w:r>
+              <w:rPr>
+                <w:sz w:val="18"/>
+                <w:szCs w:val="18"/>
+              </w:rPr>
+              <w:t xml:space="preserve"> (EXPLORATORY), v1.3-forward (54b5c73); unchanged in v1.4 (4dabbfe). Reported values are from v1.4.</w:t>
             </w:r>
           </w:p>
         </w:tc>
@@ -4465,7 +4851,23 @@
           <w:sz w:val="18"/>
           <w:szCs w:val="18"/>
         </w:rPr>
-        <w:t xml:space="preserve">Two sensitivity analyses reported in the manuscript were also added during revision: the primary analysis without p12, fixed in config_v1_4.json (P12_DECISION) before the v1.4 run, and the anomaly correlation for the main comparisons (post hoc; </w:t>
+        <w:t>Two sensitivity analyses reported in the manuscript were also added in the second stage: the primary analysis without p12, fixed in config_v1_</w:t>
+      </w:r>
+      <w:proofErr w:type="gramStart"/>
+      <w:r>
+        <w:rPr>
+          <w:sz w:val="18"/>
+          <w:szCs w:val="18"/>
+        </w:rPr>
+        <w:t>4.json</w:t>
+      </w:r>
+      <w:proofErr w:type="gramEnd"/>
+      <w:r>
+        <w:rPr>
+          <w:sz w:val="18"/>
+          <w:szCs w:val="18"/>
+        </w:rPr>
+        <w:t xml:space="preserve"> (P12_DECISION) before the v1.4 run, and the anomaly correlation for the main comparisons (post hoc; </w:t>
       </w:r>
       <w:proofErr w:type="spellStart"/>
       <w:r>
@@ -4473,9 +4875,18 @@
           <w:sz w:val="18"/>
           <w:szCs w:val="18"/>
         </w:rPr>
-        <w:t>NDI_sensitivity_anomaly.ipynb</w:t>
+        <w:t>NDI_sensitivity_</w:t>
+      </w:r>
+      <w:proofErr w:type="gramStart"/>
+      <w:r>
+        <w:rPr>
+          <w:sz w:val="18"/>
+          <w:szCs w:val="18"/>
+        </w:rPr>
+        <w:t>anomaly.ipynb</w:t>
       </w:r>
       <w:proofErr w:type="spellEnd"/>
+      <w:proofErr w:type="gramEnd"/>
       <w:r>
         <w:rPr>
           <w:sz w:val="18"/>
@@ -4503,6 +4914,21 @@
           <w:szCs w:val="18"/>
         </w:rPr>
         <w:t>: bias-corrected and accelerated; SESOI: smallest effect size of interest; TOST: two one-sided tests.</w:t>
+      </w:r>
+    </w:p>
+    <w:p>
+      <w:pPr>
+        <w:spacing w:before="160" w:after="120" w:line="264" w:lineRule="auto"/>
+      </w:pPr>
+      <w:r>
+        <w:rPr>
+          <w:b/>
+          <w:bCs/>
+        </w:rPr>
+        <w:t>Positive-control simulation.</w:t>
+      </w:r>
+      <w:r>
+        <w:t xml:space="preserve"> A positive-control simulation was specified with the analyses above and started under tag v1.4-task4. It was not completed, and no results from it are reported.</w:t>
       </w:r>
     </w:p>
     <w:p>
@@ -4567,7 +4993,7 @@
           <w:left w:w="10" w:type="dxa"/>
           <w:right w:w="10" w:type="dxa"/>
         </w:tblCellMar>
-        <w:tblLook w:val="0000" w:firstRow="0" w:lastRow="0" w:firstColumn="0" w:lastColumn="0" w:noHBand="0" w:noVBand="0"/>
+        <w:tblLook w:val="04A0" w:firstRow="1" w:lastRow="0" w:firstColumn="1" w:lastColumn="0" w:noHBand="0" w:noVBand="1"/>
       </w:tblPr>
       <w:tblGrid>
         <w:gridCol w:w="1910"/>
@@ -4576,6 +5002,12 @@
         <w:gridCol w:w="4066"/>
       </w:tblGrid>
       <w:tr>
+        <w:tblPrEx>
+          <w:tblCellMar>
+            <w:top w:w="0" w:type="dxa"/>
+            <w:bottom w:w="0" w:type="dxa"/>
+          </w:tblCellMar>
+        </w:tblPrEx>
         <w:trPr>
           <w:cantSplit/>
           <w:tblHeader/>
@@ -4706,6 +5138,12 @@
         </w:tc>
       </w:tr>
       <w:tr>
+        <w:tblPrEx>
+          <w:tblCellMar>
+            <w:top w:w="0" w:type="dxa"/>
+            <w:bottom w:w="0" w:type="dxa"/>
+          </w:tblCellMar>
+        </w:tblPrEx>
         <w:trPr>
           <w:cantSplit/>
         </w:trPr>
@@ -4758,12 +5196,21 @@
             <w:pPr>
               <w:spacing w:after="40"/>
             </w:pPr>
-            <w:r>
-              <w:rPr>
-                <w:sz w:val="18"/>
-                <w:szCs w:val="18"/>
-              </w:rPr>
-              <w:t>Every participant's dates in the feature frame are unique and consecutive; the run stops otherwise.</w:t>
+            <w:proofErr w:type="gramStart"/>
+            <w:r>
+              <w:rPr>
+                <w:sz w:val="18"/>
+                <w:szCs w:val="18"/>
+              </w:rPr>
+              <w:t>Every</w:t>
+            </w:r>
+            <w:proofErr w:type="gramEnd"/>
+            <w:r>
+              <w:rPr>
+                <w:sz w:val="18"/>
+                <w:szCs w:val="18"/>
+              </w:rPr>
+              <w:t xml:space="preserve"> participant's dates in the feature frame are unique and consecutive; the run stops otherwise.</w:t>
             </w:r>
           </w:p>
         </w:tc>
@@ -4860,6 +5307,12 @@
         </w:tc>
       </w:tr>
       <w:tr>
+        <w:tblPrEx>
+          <w:tblCellMar>
+            <w:top w:w="0" w:type="dxa"/>
+            <w:bottom w:w="0" w:type="dxa"/>
+          </w:tblCellMar>
+        </w:tblPrEx>
         <w:trPr>
           <w:cantSplit/>
         </w:trPr>
@@ -4946,7 +5399,7 @@
                 <w:sz w:val="18"/>
                 <w:szCs w:val="18"/>
               </w:rPr>
-              <w:t>16 available. Versions v1 to v1.3 loaded 15, because p12 was dropped by the loader error (correction 5). Version 1.4 loaded 16 of 16; p12 has 152 rows and 129 scored test folds and meets the existing rules.</w:t>
+              <w:t>16 available. Versions v1 to v1.3 loaded 15, because p12 was dropped by the loader error (fix 5). Version 1.4 loaded 16 of 16; p12 has 152 rows and 129 scored test folds and meets the existing rules.</w:t>
             </w:r>
           </w:p>
         </w:tc>
@@ -5014,6 +5467,12 @@
         </w:tc>
       </w:tr>
       <w:tr>
+        <w:tblPrEx>
+          <w:tblCellMar>
+            <w:top w:w="0" w:type="dxa"/>
+            <w:bottom w:w="0" w:type="dxa"/>
+          </w:tblCellMar>
+        </w:tblPrEx>
         <w:trPr>
           <w:cantSplit/>
         </w:trPr>
@@ -5130,9 +5589,18 @@
                 <w:sz w:val="18"/>
                 <w:szCs w:val="18"/>
               </w:rPr>
-              <w:t>NDI_sleep_score_check.ipynb</w:t>
+              <w:t>NDI_sleep_score_</w:t>
+            </w:r>
+            <w:proofErr w:type="gramStart"/>
+            <w:r>
+              <w:rPr>
+                <w:sz w:val="18"/>
+                <w:szCs w:val="18"/>
+              </w:rPr>
+              <w:t>check.ipynb</w:t>
             </w:r>
             <w:proofErr w:type="spellEnd"/>
+            <w:proofErr w:type="gramEnd"/>
           </w:p>
           <w:p>
             <w:pPr>
@@ -5188,6 +5656,12 @@
         </w:tc>
       </w:tr>
       <w:tr>
+        <w:tblPrEx>
+          <w:tblCellMar>
+            <w:top w:w="0" w:type="dxa"/>
+            <w:bottom w:w="0" w:type="dxa"/>
+          </w:tblCellMar>
+        </w:tblPrEx>
         <w:trPr>
           <w:cantSplit/>
         </w:trPr>
@@ -5390,38 +5864,14 @@
           <w:sz w:val="20"/>
           <w:szCs w:val="20"/>
         </w:rPr>
-        <w:t xml:space="preserve">: analysis code, configuration files, and results archive, release v1.5-final. GitHub. 2026. URL: </w:t>
-      </w:r>
-      <w:hyperlink r:id="rId5" w:history="1">
-        <w:r>
-          <w:rPr>
-            <w:rStyle w:val="Hyperlink"/>
-            <w:sz w:val="20"/>
-            <w:szCs w:val="20"/>
-          </w:rPr>
-          <w:t>https://github.com/hpatel09112004/NDI_Depression_Risk_Index</w:t>
-        </w:r>
-      </w:hyperlink>
-      <w:r>
-        <w:rPr>
-          <w:sz w:val="20"/>
-          <w:szCs w:val="20"/>
-        </w:rPr>
-        <w:t xml:space="preserve"> </w:t>
+        <w:t>: analysis code, configuration files, and results archive, release v1.5-final. GitHub. 2026. URL: https://github.com/hpatel09112004/NDI_Depression_Risk_Index [accessed 2026-10-1</w:t>
       </w:r>
       <w:r>
         <w:rPr>
           <w:sz w:val="20"/>
           <w:szCs w:val="20"/>
         </w:rPr>
-        <w:t>[accessed 2026-10-1</w:t>
-      </w:r>
-      <w:r>
-        <w:rPr>
-          <w:sz w:val="20"/>
-          <w:szCs w:val="20"/>
-        </w:rPr>
-        <w:t>8</w:t>
+        <w:t>9</w:t>
       </w:r>
       <w:r>
         <w:rPr>
@@ -5515,10 +5965,10 @@
 <file path=word/numbering.xml><?xml version="1.0" encoding="utf-8"?>
 <w:numbering xmlns:wpc="http://schemas.microsoft.com/office/word/2010/wordprocessingCanvas" xmlns:cx="http://schemas.microsoft.com/office/drawing/2014/chartex" xmlns:cx1="http://schemas.microsoft.com/office/drawing/2015/9/8/chartex" xmlns:cx2="http://schemas.microsoft.com/office/drawing/2015/10/21/chartex" xmlns:cx3="http://schemas.microsoft.com/office/drawing/2016/5/9/chartex" xmlns:cx4="http://schemas.microsoft.com/office/drawing/2016/5/10/chartex" xmlns:cx5="http://schemas.microsoft.com/office/drawing/2016/5/11/chartex" xmlns:cx6="http://schemas.microsoft.com/office/drawing/2016/5/12/chartex" xmlns:cx7="http://schemas.microsoft.com/office/drawing/2016/5/13/chartex" xmlns:cx8="http://schemas.microsoft.com/office/drawing/2016/5/14/chartex" xmlns:mc="http://schemas.openxmlformats.org/markup-compatibility/2006" xmlns:aink="http://schemas.microsoft.com/office/drawing/2016/ink" xmlns:am3d="http://schemas.microsoft.com/office/drawing/2017/model3d" xmlns:o="urn:schemas-microsoft-com:office:office" xmlns:oel="http://schemas.microsoft.com/office/2019/extlst" xmlns:r="http://schemas.openxmlformats.org/officeDocument/2006/relationships" xmlns:m="http://schemas.openxmlformats.org/officeDocument/2006/math" xmlns:v="urn:schemas-microsoft-com:vml" xmlns:wp14="http://schemas.microsoft.com/office/word/2010/wordprocessingDrawing" xmlns:wp="http://schemas.openxmlformats.org/drawingml/2006/wordprocessingDrawing" xmlns:w10="urn:schemas-microsoft-com:office:word" xmlns:w="http://schemas.openxmlformats.org/wordprocessingml/2006/main" xmlns:w14="http://schemas.microsoft.com/office/word/2010/wordml" xmlns:w15="http://schemas.microsoft.com/office/word/2012/wordml" xmlns:w16cex="http://schemas.microsoft.com/office/word/2018/wordml/cex" xmlns:w16cid="http://schemas.microsoft.com/office/word/2016/wordml/cid" xmlns:w16="http://schemas.microsoft.com/office/word/2018/wordml" xmlns:w16du="http://schemas.microsoft.com/office/word/2023/wordml/word16du" xmlns:w16sdtdh="http://schemas.microsoft.com/office/word/2020/wordml/sdtdatahash" xmlns:w16sdtfl="http://schemas.microsoft.com/office/word/2024/wordml/sdtformatlock" xmlns:w16se="http://schemas.microsoft.com/office/word/2015/wordml/symex" xmlns:wpg="http://schemas.microsoft.com/office/word/2010/wordprocessingGroup" xmlns:wpi="http://schemas.microsoft.com/office/word/2010/wordprocessingInk" xmlns:wne="http://schemas.microsoft.com/office/word/2006/wordml" xmlns:wps="http://schemas.microsoft.com/office/word/2010/wordprocessingShape" mc:Ignorable="w14 w15 w16se w16cid w16 w16cex w16sdtdh w16sdtfl w16du wp14">
   <w:abstractNum w:abstractNumId="0" w15:restartNumberingAfterBreak="0">
-    <w:nsid w:val="64BA0A8B"/>
+    <w:nsid w:val="7BFB3030"/>
     <w:multiLevelType w:val="hybridMultilevel"/>
-    <w:tmpl w:val="C97EA21E"/>
-    <w:lvl w:ilvl="0" w:tplc="D9FE6DE6">
+    <w:tmpl w:val="7FF424CE"/>
+    <w:lvl w:ilvl="0" w:tplc="5412B8CE">
       <w:start w:val="1"/>
       <w:numFmt w:val="bullet"/>
       <w:lvlText w:val="●"/>
@@ -5527,7 +5977,7 @@
         <w:ind w:left="720" w:hanging="360"/>
       </w:pPr>
     </w:lvl>
-    <w:lvl w:ilvl="1" w:tplc="7108AD58">
+    <w:lvl w:ilvl="1" w:tplc="6DC45D36">
       <w:start w:val="1"/>
       <w:numFmt w:val="bullet"/>
       <w:lvlText w:val="○"/>
@@ -5536,7 +5986,7 @@
         <w:ind w:left="1440" w:hanging="360"/>
       </w:pPr>
     </w:lvl>
-    <w:lvl w:ilvl="2" w:tplc="7DEE8AB0">
+    <w:lvl w:ilvl="2" w:tplc="4830DC2E">
       <w:start w:val="1"/>
       <w:numFmt w:val="bullet"/>
       <w:lvlText w:val="■"/>
@@ -5545,7 +5995,7 @@
         <w:ind w:left="2160" w:hanging="360"/>
       </w:pPr>
     </w:lvl>
-    <w:lvl w:ilvl="3" w:tplc="F49A391C">
+    <w:lvl w:ilvl="3" w:tplc="712AF47C">
       <w:start w:val="1"/>
       <w:numFmt w:val="bullet"/>
       <w:lvlText w:val="●"/>
@@ -5554,7 +6004,7 @@
         <w:ind w:left="2880" w:hanging="360"/>
       </w:pPr>
     </w:lvl>
-    <w:lvl w:ilvl="4" w:tplc="5776E4E8">
+    <w:lvl w:ilvl="4" w:tplc="E93C44BC">
       <w:start w:val="1"/>
       <w:numFmt w:val="bullet"/>
       <w:lvlText w:val="○"/>
@@ -5563,7 +6013,7 @@
         <w:ind w:left="3600" w:hanging="360"/>
       </w:pPr>
     </w:lvl>
-    <w:lvl w:ilvl="5" w:tplc="4B5A43A8">
+    <w:lvl w:ilvl="5" w:tplc="37A29AA2">
       <w:start w:val="1"/>
       <w:numFmt w:val="bullet"/>
       <w:lvlText w:val="■"/>
@@ -5572,7 +6022,7 @@
         <w:ind w:left="4320" w:hanging="360"/>
       </w:pPr>
     </w:lvl>
-    <w:lvl w:ilvl="6" w:tplc="06E4C158">
+    <w:lvl w:ilvl="6" w:tplc="DE142B84">
       <w:start w:val="1"/>
       <w:numFmt w:val="bullet"/>
       <w:lvlText w:val="●"/>
@@ -5581,7 +6031,7 @@
         <w:ind w:left="5040" w:hanging="360"/>
       </w:pPr>
     </w:lvl>
-    <w:lvl w:ilvl="7" w:tplc="CBECCF96">
+    <w:lvl w:ilvl="7" w:tplc="E9F4CD52">
       <w:start w:val="1"/>
       <w:numFmt w:val="bullet"/>
       <w:lvlText w:val="●"/>
@@ -5590,7 +6040,7 @@
         <w:ind w:left="5760" w:hanging="360"/>
       </w:pPr>
     </w:lvl>
-    <w:lvl w:ilvl="8" w:tplc="323EC956">
+    <w:lvl w:ilvl="8" w:tplc="417455D0">
       <w:start w:val="1"/>
       <w:numFmt w:val="bullet"/>
       <w:lvlText w:val="●"/>
@@ -5600,7 +6050,7 @@
       </w:pPr>
     </w:lvl>
   </w:abstractNum>
-  <w:num w:numId="1" w16cid:durableId="1233932920">
+  <w:num w:numId="1" w16cid:durableId="926231542">
     <w:abstractNumId w:val="0"/>
     <w:lvlOverride w:ilvl="0">
       <w:startOverride w:val="1"/>
@@ -6211,18 +6661,6 @@
       <w:szCs w:val="20"/>
     </w:rPr>
   </w:style>
-  <w:style w:type="character" w:styleId="UnresolvedMention">
-    <w:name w:val="Unresolved Mention"/>
-    <w:basedOn w:val="DefaultParagraphFont"/>
-    <w:uiPriority w:val="99"/>
-    <w:semiHidden/>
-    <w:unhideWhenUsed/>
-    <w:rsid w:val="002C5885"/>
-    <w:rPr>
-      <w:color w:val="605E5C"/>
-      <w:shd w:val="clear" w:color="auto" w:fill="E1DFDD"/>
-    </w:rPr>
-  </w:style>
 </w:styles>
 </file>
 

</xml_diff>